<commit_message>
Unificar formato de los campos a completar en el contrato de mutuo
Los placeholders de las cláusulas Séptima y Octava y del bloque de firmas
quedaban en texto plano, a diferencia del resto que va resaltado. Se
unifican para que ningún campo pendiente pase inadvertido al completar
el modelo.
</commit_message>
<xml_diff>
--- a/documentos/legal/Contrato de Mutuo - Pacheco (modelo genérico).docx
+++ b/documentos/legal/Contrato de Mutuo - Pacheco (modelo genérico).docx
@@ -823,14 +823,31 @@
       <w:r>
         <w:rPr>
           <w:rFonts w:ascii="Calibri" w:cs="Calibri" w:eastAsia="Calibri" w:hAnsi="Calibri"/>
-          <w:b w:val="false"/>
-          <w:bCs w:val="false"/>
-          <w:i w:val="false"/>
-          <w:iCs w:val="false"/>
-          <w:sz w:val="22"/>
-          <w:szCs w:val="22"/>
-        </w:rPr>
-        <w:t xml:space="preserve">EL MUTUARIO podrá cancelar anticipadamente, en forma total o parcial, el saldo adeudado en cualquier momento, sin penalidad alguna, debiendo notificar dicha intención a EL MUTUANTE con una antelación mínima de [5] días hábiles.</w:t>
+          <w:sz w:val="22"/>
+          <w:szCs w:val="22"/>
+        </w:rPr>
+        <w:t xml:space="preserve">EL MUTUARIO podrá cancelar anticipadamente, en forma total o parcial, el saldo adeudado en cualquier momento, sin penalidad alguna, debiendo notificar dicha intención a EL MUTUANTE con una antelación mínima de </w:t>
+      </w:r>
+      <w:r>
+        <w:rPr>
+          <w:rFonts w:ascii="Calibri" w:cs="Calibri" w:eastAsia="Calibri" w:hAnsi="Calibri"/>
+          <w:b/>
+          <w:bCs/>
+          <w:i/>
+          <w:iCs/>
+          <w:color w:val="B00000"/>
+          <w:sz w:val="22"/>
+          <w:szCs w:val="22"/>
+        </w:rPr>
+        <w:t xml:space="preserve">[CANTIDAD]</w:t>
+      </w:r>
+      <w:r>
+        <w:rPr>
+          <w:rFonts w:ascii="Calibri" w:cs="Calibri" w:eastAsia="Calibri" w:hAnsi="Calibri"/>
+          <w:sz w:val="22"/>
+          <w:szCs w:val="22"/>
+        </w:rPr>
+        <w:t xml:space="preserve"> días hábiles.</w:t>
       </w:r>
     </w:p>
     <w:p>
@@ -857,14 +874,31 @@
       <w:r>
         <w:rPr>
           <w:rFonts w:ascii="Calibri" w:cs="Calibri" w:eastAsia="Calibri" w:hAnsi="Calibri"/>
-          <w:b w:val="false"/>
-          <w:bCs w:val="false"/>
-          <w:i w:val="false"/>
-          <w:iCs w:val="false"/>
-          <w:sz w:val="22"/>
-          <w:szCs w:val="22"/>
-        </w:rPr>
-        <w:t xml:space="preserve">Todos los gastos, sellados e impuestos que graven el presente Contrato serán soportados por [ambas Partes, por partes iguales / EL MUTUARIO], conforme a la normativa fiscal vigente.</w:t>
+          <w:sz w:val="22"/>
+          <w:szCs w:val="22"/>
+        </w:rPr>
+        <w:t xml:space="preserve">Todos los gastos, sellados e impuestos que graven el presente Contrato serán soportados por </w:t>
+      </w:r>
+      <w:r>
+        <w:rPr>
+          <w:rFonts w:ascii="Calibri" w:cs="Calibri" w:eastAsia="Calibri" w:hAnsi="Calibri"/>
+          <w:b/>
+          <w:bCs/>
+          <w:i/>
+          <w:iCs/>
+          <w:color w:val="B00000"/>
+          <w:sz w:val="22"/>
+          <w:szCs w:val="22"/>
+        </w:rPr>
+        <w:t xml:space="preserve">[ambas Partes, por partes iguales / EL MUTUARIO]</w:t>
+      </w:r>
+      <w:r>
+        <w:rPr>
+          <w:rFonts w:ascii="Calibri" w:cs="Calibri" w:eastAsia="Calibri" w:hAnsi="Calibri"/>
+          <w:sz w:val="22"/>
+          <w:szCs w:val="22"/>
+        </w:rPr>
+        <w:t xml:space="preserve">, conforme a la normativa fiscal vigente.</w:t>
       </w:r>
     </w:p>
     <w:p>
@@ -1018,10 +1052,11 @@
             <w:r>
               <w:rPr>
                 <w:rFonts w:ascii="Calibri" w:cs="Calibri" w:eastAsia="Calibri" w:hAnsi="Calibri"/>
-                <w:b w:val="false"/>
-                <w:bCs w:val="false"/>
-                <w:i w:val="false"/>
-                <w:iCs w:val="false"/>
+                <w:b/>
+                <w:bCs/>
+                <w:i/>
+                <w:iCs/>
+                <w:color w:val="B00000"/>
                 <w:sz w:val="22"/>
                 <w:szCs w:val="22"/>
               </w:rPr>
@@ -1030,16 +1065,17 @@
           </w:p>
           <w:p>
             <w:pPr>
-              <w:spacing w:after="200" w:line="300"/>
+              <w:spacing w:after="0" w:line="300"/>
               <w:jc w:val="center"/>
             </w:pPr>
             <w:r>
               <w:rPr>
                 <w:rFonts w:ascii="Calibri" w:cs="Calibri" w:eastAsia="Calibri" w:hAnsi="Calibri"/>
-                <w:b w:val="false"/>
-                <w:bCs w:val="false"/>
-                <w:i w:val="false"/>
-                <w:iCs w:val="false"/>
+                <w:b/>
+                <w:bCs/>
+                <w:i/>
+                <w:iCs/>
+                <w:color w:val="B00000"/>
                 <w:sz w:val="22"/>
                 <w:szCs w:val="22"/>
               </w:rPr>
@@ -1095,10 +1131,11 @@
             <w:r>
               <w:rPr>
                 <w:rFonts w:ascii="Calibri" w:cs="Calibri" w:eastAsia="Calibri" w:hAnsi="Calibri"/>
-                <w:b w:val="false"/>
-                <w:bCs w:val="false"/>
-                <w:i w:val="false"/>
-                <w:iCs w:val="false"/>
+                <w:b/>
+                <w:bCs/>
+                <w:i/>
+                <w:iCs/>
+                <w:color w:val="B00000"/>
                 <w:sz w:val="22"/>
                 <w:szCs w:val="22"/>
               </w:rPr>
@@ -1107,16 +1144,17 @@
           </w:p>
           <w:p>
             <w:pPr>
-              <w:spacing w:after="200" w:line="300"/>
+              <w:spacing w:after="0" w:line="300"/>
               <w:jc w:val="center"/>
             </w:pPr>
             <w:r>
               <w:rPr>
                 <w:rFonts w:ascii="Calibri" w:cs="Calibri" w:eastAsia="Calibri" w:hAnsi="Calibri"/>
-                <w:b w:val="false"/>
-                <w:bCs w:val="false"/>
-                <w:i w:val="false"/>
-                <w:iCs w:val="false"/>
+                <w:b/>
+                <w:bCs/>
+                <w:i/>
+                <w:iCs/>
+                <w:color w:val="B00000"/>
                 <w:sz w:val="22"/>
                 <w:szCs w:val="22"/>
               </w:rPr>

</xml_diff>